<commit_message>
Kök gösterimini web, çalışma kâğıdı ve günlük planlarda düzelt
</commit_message>
<xml_diff>
--- a/public/dosyalar/gunluk-plan/8-sinif-matematik-gunluk-plan-2026-2027.docx
+++ b/public/dosyalar/gunluk-plan/8-sinif-matematik-gunluk-plan-2026-2027.docx
@@ -5144,7 +5144,31 @@
                 <w:b w:val="0"/>
                 <w:sz w:val="19"/>
               </w:rPr>
-              <w:t>Örneğin √31 sayısının 5 ile 6 sayıları arasında bulunduğunu ve 6’ya daha yakın olduğunu belirlemeye yönelik çalışmalar yapılır.</w:t>
+              <w:t xml:space="preserve">Örneğin </w:t>
+            </w:r>
+            <m:oMath>
+              <m:rad>
+                <m:radPr>
+                  <m:degHide m:val="1"/>
+                </m:radPr>
+                <m:deg/>
+                <m:e>
+                  <m:r>
+                    <w:rPr>
+                      <w:b w:val="0"/>
+                      <w:sz w:val="19"/>
+                    </w:rPr>
+                    <m:t>31</m:t>
+                  </m:r>
+                </m:e>
+              </m:rad>
+            </m:oMath>
+            <w:r>
+              <w:rPr>
+                <w:b w:val="0"/>
+                <w:sz w:val="19"/>
+              </w:rPr>
+              <w:t xml:space="preserve"> sayısının 5 ile 6 sayıları arasında bulunduğunu ve 6’ya daha yakın olduğunu belirlemeye yönelik çalışmalar yapılır.</w:t>
             </w:r>
           </w:p>
         </w:tc>
@@ -6000,7 +6024,55 @@
                 <w:b w:val="0"/>
                 <w:sz w:val="19"/>
               </w:rPr>
-              <w:t>M.8.1.3.3. Kareköklü bir ifadeyi a√b şeklinde yazar ve a√b şeklindeki ifadede katsayıyı kök içine alır.</w:t>
+              <w:t xml:space="preserve">M.8.1.3.3. Kareköklü bir ifadeyi a</w:t>
+            </w:r>
+            <m:oMath>
+              <m:rad>
+                <m:radPr>
+                  <m:degHide m:val="1"/>
+                </m:radPr>
+                <m:deg/>
+                <m:e>
+                  <m:r>
+                    <w:rPr>
+                      <w:b w:val="0"/>
+                      <w:sz w:val="19"/>
+                    </w:rPr>
+                    <m:t>b</m:t>
+                  </m:r>
+                </m:e>
+              </m:rad>
+            </m:oMath>
+            <w:r>
+              <w:rPr>
+                <w:b w:val="0"/>
+                <w:sz w:val="19"/>
+              </w:rPr>
+              <w:t xml:space="preserve"> şeklinde yazar ve a</w:t>
+            </w:r>
+            <m:oMath>
+              <m:rad>
+                <m:radPr>
+                  <m:degHide m:val="1"/>
+                </m:radPr>
+                <m:deg/>
+                <m:e>
+                  <m:r>
+                    <w:rPr>
+                      <w:b w:val="0"/>
+                      <w:sz w:val="19"/>
+                    </w:rPr>
+                    <m:t>b</m:t>
+                  </m:r>
+                </m:e>
+              </m:rad>
+            </m:oMath>
+            <w:r>
+              <w:rPr>
+                <w:b w:val="0"/>
+                <w:sz w:val="19"/>
+              </w:rPr>
+              <w:t xml:space="preserve"> şeklindeki ifadede katsayıyı kök içine alır.</w:t>
             </w:r>
           </w:p>
         </w:tc>

</xml_diff>